<commit_message>
added to docs and updated website
</commit_message>
<xml_diff>
--- a/Documentation/Weekly Report/week11/CMSC-4920-Week11Report-Group2.docx
+++ b/Documentation/Weekly Report/week11/CMSC-4920-Week11Report-Group2.docx
@@ -683,12 +683,20 @@
         </w:rPr>
         <w:t xml:space="preserve">Week </w:t>
       </w:r>
-      <w:r>
-        <w:rPr>
-          <w:rFonts w:ascii="Times New Roman" w:hAnsi="Times New Roman" w:cs="Times New Roman"/>
-        </w:rPr>
-        <w:t>10</w:t>
-      </w:r>
+      <w:proofErr w:type="gramStart"/>
+      <w:r>
+        <w:rPr>
+          <w:rFonts w:ascii="Times New Roman" w:hAnsi="Times New Roman" w:cs="Times New Roman"/>
+        </w:rPr>
+        <w:t>1</w:t>
+      </w:r>
+      <w:r>
+        <w:rPr>
+          <w:rFonts w:ascii="Times New Roman" w:hAnsi="Times New Roman" w:cs="Times New Roman"/>
+        </w:rPr>
+        <w:t>1</w:t>
+      </w:r>
+      <w:proofErr w:type="gramEnd"/>
     </w:p>
     <w:p>
       <w:pPr>
@@ -912,7 +920,7 @@
             </w:rPr>
             <w:fldChar w:fldCharType="separate"/>
           </w:r>
-          <w:hyperlink w:anchor="_Toc225582567" w:history="1">
+          <w:hyperlink w:anchor="_Toc225707084" w:history="1">
             <w:r>
               <w:rPr>
                 <w:rStyle w:val="Hyperlink"/>
@@ -950,7 +958,7 @@
                 <w:noProof/>
                 <w:webHidden/>
               </w:rPr>
-              <w:instrText xml:space="preserve"> PAGEREF _Toc225582567 \h </w:instrText>
+              <w:instrText xml:space="preserve"> PAGEREF _Toc225707084 \h </w:instrText>
             </w:r>
             <w:r>
               <w:rPr>
@@ -970,7 +978,7 @@
                 <w:noProof/>
                 <w:webHidden/>
               </w:rPr>
-              <w:t>1</w:t>
+              <w:t>2</w:t>
             </w:r>
             <w:r>
               <w:rPr>
@@ -992,7 +1000,7 @@
               <w:noProof/>
             </w:rPr>
           </w:pPr>
-          <w:hyperlink w:anchor="_Toc225582568" w:history="1">
+          <w:hyperlink w:anchor="_Toc225707085" w:history="1">
             <w:r>
               <w:rPr>
                 <w:rStyle w:val="Hyperlink"/>
@@ -1022,7 +1030,7 @@
                 <w:noProof/>
                 <w:webHidden/>
               </w:rPr>
-              <w:instrText xml:space="preserve"> PAGEREF _Toc225582568 \h </w:instrText>
+              <w:instrText xml:space="preserve"> PAGEREF _Toc225707085 \h </w:instrText>
             </w:r>
             <w:r>
               <w:rPr>
@@ -1064,7 +1072,7 @@
               <w:noProof/>
             </w:rPr>
           </w:pPr>
-          <w:hyperlink w:anchor="_Toc225582569" w:history="1">
+          <w:hyperlink w:anchor="_Toc225707086" w:history="1">
             <w:r>
               <w:rPr>
                 <w:rStyle w:val="Hyperlink"/>
@@ -1094,7 +1102,7 @@
                 <w:noProof/>
                 <w:webHidden/>
               </w:rPr>
-              <w:instrText xml:space="preserve"> PAGEREF _Toc225582569 \h </w:instrText>
+              <w:instrText xml:space="preserve"> PAGEREF _Toc225707086 \h </w:instrText>
             </w:r>
             <w:r>
               <w:rPr>
@@ -1114,7 +1122,7 @@
                 <w:noProof/>
                 <w:webHidden/>
               </w:rPr>
-              <w:t>3</w:t>
+              <w:t>4</w:t>
             </w:r>
             <w:r>
               <w:rPr>
@@ -1136,7 +1144,7 @@
               <w:noProof/>
             </w:rPr>
           </w:pPr>
-          <w:hyperlink w:anchor="_Toc225582570" w:history="1">
+          <w:hyperlink w:anchor="_Toc225707087" w:history="1">
             <w:r>
               <w:rPr>
                 <w:rStyle w:val="Hyperlink"/>
@@ -1166,7 +1174,7 @@
                 <w:noProof/>
                 <w:webHidden/>
               </w:rPr>
-              <w:instrText xml:space="preserve"> PAGEREF _Toc225582570 \h </w:instrText>
+              <w:instrText xml:space="preserve"> PAGEREF _Toc225707087 \h </w:instrText>
             </w:r>
             <w:r>
               <w:rPr>
@@ -1208,7 +1216,7 @@
               <w:noProof/>
             </w:rPr>
           </w:pPr>
-          <w:hyperlink w:anchor="_Toc225582571" w:history="1">
+          <w:hyperlink w:anchor="_Toc225707088" w:history="1">
             <w:r>
               <w:rPr>
                 <w:rStyle w:val="Hyperlink"/>
@@ -1238,7 +1246,7 @@
                 <w:noProof/>
                 <w:webHidden/>
               </w:rPr>
-              <w:instrText xml:space="preserve"> PAGEREF _Toc225582571 \h </w:instrText>
+              <w:instrText xml:space="preserve"> PAGEREF _Toc225707088 \h </w:instrText>
             </w:r>
             <w:r>
               <w:rPr>
@@ -1258,7 +1266,7 @@
                 <w:noProof/>
                 <w:webHidden/>
               </w:rPr>
-              <w:t>4</w:t>
+              <w:t>5</w:t>
             </w:r>
             <w:r>
               <w:rPr>
@@ -1280,7 +1288,7 @@
               <w:noProof/>
             </w:rPr>
           </w:pPr>
-          <w:hyperlink w:anchor="_Toc225582572" w:history="1">
+          <w:hyperlink w:anchor="_Toc225707089" w:history="1">
             <w:r>
               <w:rPr>
                 <w:rStyle w:val="Hyperlink"/>
@@ -1310,7 +1318,7 @@
                 <w:noProof/>
                 <w:webHidden/>
               </w:rPr>
-              <w:instrText xml:space="preserve"> PAGEREF _Toc225582572 \h </w:instrText>
+              <w:instrText xml:space="preserve"> PAGEREF _Toc225707089 \h </w:instrText>
             </w:r>
             <w:r>
               <w:rPr>
@@ -1330,7 +1338,7 @@
                 <w:noProof/>
                 <w:webHidden/>
               </w:rPr>
-              <w:t>5</w:t>
+              <w:t>6</w:t>
             </w:r>
             <w:r>
               <w:rPr>
@@ -1382,7 +1390,7 @@
           <w:szCs w:val="24"/>
         </w:rPr>
       </w:pPr>
-      <w:bookmarkStart w:id="0" w:name="_Toc225582567"/>
+      <w:bookmarkStart w:id="0" w:name="_Toc225707084"/>
       <w:r>
         <w:rPr>
           <w:rFonts w:ascii="Times New Roman" w:hAnsi="Times New Roman" w:cs="Times New Roman"/>
@@ -1432,7 +1440,63 @@
         <w:rPr>
           <w:rFonts w:ascii="Times New Roman" w:hAnsi="Times New Roman" w:cs="Times New Roman"/>
         </w:rPr>
-        <w:t xml:space="preserve"> the end of the Spring 2026 semester, our Senior Project team viewed this week as both finalization and heavy development. Features were both built and polished. Overall debugging was held to ensure that remaining bugs were resolved. User study was additionally held to ensure that the Vulcan Activity Tracker meets both set requirements and usability. Several goals were set for this week to maintain proper schedule.</w:t>
+        <w:t xml:space="preserve"> the end of the Spring 2026 semester, our Senior Project team viewed this week as both finalization and heavy development. Features were both built and polished. Overall debugging </w:t>
+      </w:r>
+      <w:proofErr w:type="gramStart"/>
+      <w:r>
+        <w:rPr>
+          <w:rFonts w:ascii="Times New Roman" w:hAnsi="Times New Roman" w:cs="Times New Roman"/>
+        </w:rPr>
+        <w:t>was held</w:t>
+      </w:r>
+      <w:proofErr w:type="gramEnd"/>
+      <w:r>
+        <w:rPr>
+          <w:rFonts w:ascii="Times New Roman" w:hAnsi="Times New Roman" w:cs="Times New Roman"/>
+        </w:rPr>
+        <w:t xml:space="preserve"> to ensure that remaining bugs </w:t>
+      </w:r>
+      <w:proofErr w:type="gramStart"/>
+      <w:r>
+        <w:rPr>
+          <w:rFonts w:ascii="Times New Roman" w:hAnsi="Times New Roman" w:cs="Times New Roman"/>
+        </w:rPr>
+        <w:t>were resolved</w:t>
+      </w:r>
+      <w:proofErr w:type="gramEnd"/>
+      <w:r>
+        <w:rPr>
+          <w:rFonts w:ascii="Times New Roman" w:hAnsi="Times New Roman" w:cs="Times New Roman"/>
+        </w:rPr>
+        <w:t xml:space="preserve">. User study </w:t>
+      </w:r>
+      <w:proofErr w:type="gramStart"/>
+      <w:r>
+        <w:rPr>
+          <w:rFonts w:ascii="Times New Roman" w:hAnsi="Times New Roman" w:cs="Times New Roman"/>
+        </w:rPr>
+        <w:t>was additionally held</w:t>
+      </w:r>
+      <w:proofErr w:type="gramEnd"/>
+      <w:r>
+        <w:rPr>
+          <w:rFonts w:ascii="Times New Roman" w:hAnsi="Times New Roman" w:cs="Times New Roman"/>
+        </w:rPr>
+        <w:t xml:space="preserve"> to ensure that the Vulcan Activity Tracker meets both set requirements and usability. </w:t>
+      </w:r>
+      <w:proofErr w:type="gramStart"/>
+      <w:r>
+        <w:rPr>
+          <w:rFonts w:ascii="Times New Roman" w:hAnsi="Times New Roman" w:cs="Times New Roman"/>
+        </w:rPr>
+        <w:t>Several</w:t>
+      </w:r>
+      <w:proofErr w:type="gramEnd"/>
+      <w:r>
+        <w:rPr>
+          <w:rFonts w:ascii="Times New Roman" w:hAnsi="Times New Roman" w:cs="Times New Roman"/>
+        </w:rPr>
+        <w:t xml:space="preserve"> goals were set for this week to maintain proper schedule.</w:t>
       </w:r>
     </w:p>
     <w:p>
@@ -1447,7 +1511,7 @@
           <w:szCs w:val="24"/>
         </w:rPr>
       </w:pPr>
-      <w:bookmarkStart w:id="1" w:name="_Toc225582568"/>
+      <w:bookmarkStart w:id="1" w:name="_Toc225707085"/>
       <w:r>
         <w:rPr>
           <w:rFonts w:ascii="Times New Roman" w:hAnsi="Times New Roman" w:cs="Times New Roman"/>
@@ -1479,7 +1543,21 @@
         <w:rPr>
           <w:rFonts w:ascii="Times New Roman" w:hAnsi="Times New Roman" w:cs="Times New Roman"/>
         </w:rPr>
-        <w:t>There were a few components that were remaining since they required waiting for other pages development. For example, the friends feature now displays total counts of clubs, activities, and friends on the profile tag. This allows a user to see what kind of participation their friend had or has interacted with. The completion of this goal also resulted in construction of server-side components.</w:t>
+        <w:t xml:space="preserve">There were </w:t>
+      </w:r>
+      <w:proofErr w:type="gramStart"/>
+      <w:r>
+        <w:rPr>
+          <w:rFonts w:ascii="Times New Roman" w:hAnsi="Times New Roman" w:cs="Times New Roman"/>
+        </w:rPr>
+        <w:t>a few</w:t>
+      </w:r>
+      <w:proofErr w:type="gramEnd"/>
+      <w:r>
+        <w:rPr>
+          <w:rFonts w:ascii="Times New Roman" w:hAnsi="Times New Roman" w:cs="Times New Roman"/>
+        </w:rPr>
+        <w:t xml:space="preserve"> components that were remaining since they required waiting for other pages development. For example, the friends feature now displays total counts of clubs, activities, and friends on the profile tag. This allows a user to see what kind of participation their friend had or has interacted with. The completion of this goal also resulted in construction of server-side components.</w:t>
       </w:r>
     </w:p>
     <w:p>
@@ -1494,13 +1572,55 @@
         <w:rPr>
           <w:rFonts w:ascii="Times New Roman" w:hAnsi="Times New Roman" w:cs="Times New Roman"/>
         </w:rPr>
-        <w:t xml:space="preserve">Ui updates were the second main goal of the week. Ensuring that all pages and scaling matched was very important to us. The overall experience of the Vulcan Activity Tracker is of highest priority since user impression determines how </w:t>
-      </w:r>
-      <w:r>
-        <w:rPr>
-          <w:rFonts w:ascii="Times New Roman" w:hAnsi="Times New Roman" w:cs="Times New Roman"/>
-        </w:rPr>
-        <w:t xml:space="preserve">our app is perceived. Work was done to correct the settings page formatting and propagate fields from the server’s database. </w:t>
+        <w:t xml:space="preserve">Ui updates were the second main goal of the week. Ensuring that all pages and scaling matched was </w:t>
+      </w:r>
+      <w:proofErr w:type="gramStart"/>
+      <w:r>
+        <w:rPr>
+          <w:rFonts w:ascii="Times New Roman" w:hAnsi="Times New Roman" w:cs="Times New Roman"/>
+        </w:rPr>
+        <w:t>very important</w:t>
+      </w:r>
+      <w:proofErr w:type="gramEnd"/>
+      <w:r>
+        <w:rPr>
+          <w:rFonts w:ascii="Times New Roman" w:hAnsi="Times New Roman" w:cs="Times New Roman"/>
+        </w:rPr>
+        <w:t xml:space="preserve"> to us. The overall experience of the Vulcan Activity Tracker is of highest priority since user impression determines how </w:t>
+      </w:r>
+      <w:r>
+        <w:rPr>
+          <w:rFonts w:ascii="Times New Roman" w:hAnsi="Times New Roman" w:cs="Times New Roman"/>
+        </w:rPr>
+        <w:t xml:space="preserve">our app </w:t>
+      </w:r>
+      <w:proofErr w:type="gramStart"/>
+      <w:r>
+        <w:rPr>
+          <w:rFonts w:ascii="Times New Roman" w:hAnsi="Times New Roman" w:cs="Times New Roman"/>
+        </w:rPr>
+        <w:t>is perceived</w:t>
+      </w:r>
+      <w:proofErr w:type="gramEnd"/>
+      <w:r>
+        <w:rPr>
+          <w:rFonts w:ascii="Times New Roman" w:hAnsi="Times New Roman" w:cs="Times New Roman"/>
+        </w:rPr>
+        <w:t xml:space="preserve">. Work </w:t>
+      </w:r>
+      <w:proofErr w:type="gramStart"/>
+      <w:r>
+        <w:rPr>
+          <w:rFonts w:ascii="Times New Roman" w:hAnsi="Times New Roman" w:cs="Times New Roman"/>
+        </w:rPr>
+        <w:t>was done</w:t>
+      </w:r>
+      <w:proofErr w:type="gramEnd"/>
+      <w:r>
+        <w:rPr>
+          <w:rFonts w:ascii="Times New Roman" w:hAnsi="Times New Roman" w:cs="Times New Roman"/>
+        </w:rPr>
+        <w:t xml:space="preserve"> to correct the settings page formatting and propagate fields from the server’s database. </w:t>
       </w:r>
       <w:r>
         <w:rPr>
@@ -1521,13 +1641,69 @@
         <w:rPr>
           <w:rFonts w:ascii="Times New Roman" w:hAnsi="Times New Roman" w:cs="Times New Roman"/>
         </w:rPr>
-        <w:t>Additional development was made to the challenges and team pages. Mini team dashboards were simulated to give coaches managerial options. Team features have been limited to coaches only, verified by emails. Challenges n</w:t>
-      </w:r>
-      <w:r>
-        <w:rPr>
-          <w:rFonts w:ascii="Times New Roman" w:hAnsi="Times New Roman" w:cs="Times New Roman"/>
-        </w:rPr>
-        <w:t xml:space="preserve">ow have increased social interaction. Top three challenge participants are ranked with </w:t>
+        <w:t xml:space="preserve">Additional development </w:t>
+      </w:r>
+      <w:proofErr w:type="gramStart"/>
+      <w:r>
+        <w:rPr>
+          <w:rFonts w:ascii="Times New Roman" w:hAnsi="Times New Roman" w:cs="Times New Roman"/>
+        </w:rPr>
+        <w:t>was made</w:t>
+      </w:r>
+      <w:proofErr w:type="gramEnd"/>
+      <w:r>
+        <w:rPr>
+          <w:rFonts w:ascii="Times New Roman" w:hAnsi="Times New Roman" w:cs="Times New Roman"/>
+        </w:rPr>
+        <w:t xml:space="preserve"> to the challenges and team pages. Mini team dashboards </w:t>
+      </w:r>
+      <w:proofErr w:type="gramStart"/>
+      <w:r>
+        <w:rPr>
+          <w:rFonts w:ascii="Times New Roman" w:hAnsi="Times New Roman" w:cs="Times New Roman"/>
+        </w:rPr>
+        <w:t>were simulated</w:t>
+      </w:r>
+      <w:proofErr w:type="gramEnd"/>
+      <w:r>
+        <w:rPr>
+          <w:rFonts w:ascii="Times New Roman" w:hAnsi="Times New Roman" w:cs="Times New Roman"/>
+        </w:rPr>
+        <w:t xml:space="preserve"> to give coaches managerial options. Team features have </w:t>
+      </w:r>
+      <w:proofErr w:type="gramStart"/>
+      <w:r>
+        <w:rPr>
+          <w:rFonts w:ascii="Times New Roman" w:hAnsi="Times New Roman" w:cs="Times New Roman"/>
+        </w:rPr>
+        <w:t>been limited</w:t>
+      </w:r>
+      <w:proofErr w:type="gramEnd"/>
+      <w:r>
+        <w:rPr>
+          <w:rFonts w:ascii="Times New Roman" w:hAnsi="Times New Roman" w:cs="Times New Roman"/>
+        </w:rPr>
+        <w:t xml:space="preserve"> to coaches only, verified by emails. Challenges n</w:t>
+      </w:r>
+      <w:r>
+        <w:rPr>
+          <w:rFonts w:ascii="Times New Roman" w:hAnsi="Times New Roman" w:cs="Times New Roman"/>
+        </w:rPr>
+        <w:t xml:space="preserve">ow have increased social interaction. Top three challenge participants </w:t>
+      </w:r>
+      <w:proofErr w:type="gramStart"/>
+      <w:r>
+        <w:rPr>
+          <w:rFonts w:ascii="Times New Roman" w:hAnsi="Times New Roman" w:cs="Times New Roman"/>
+        </w:rPr>
+        <w:t>are ranked</w:t>
+      </w:r>
+      <w:proofErr w:type="gramEnd"/>
+      <w:r>
+        <w:rPr>
+          <w:rFonts w:ascii="Times New Roman" w:hAnsi="Times New Roman" w:cs="Times New Roman"/>
+        </w:rPr>
+        <w:t xml:space="preserve"> with </w:t>
       </w:r>
       <w:proofErr w:type="gramStart"/>
       <w:r>
@@ -1615,12 +1791,14 @@
         </w:rPr>
         <w:t xml:space="preserve">The last goal of week </w:t>
       </w:r>
+      <w:proofErr w:type="gramStart"/>
       <w:r>
         <w:rPr>
           <w:rFonts w:ascii="Times New Roman" w:hAnsi="Times New Roman" w:cs="Times New Roman"/>
         </w:rPr>
         <w:t>11</w:t>
       </w:r>
+      <w:proofErr w:type="gramEnd"/>
       <w:r>
         <w:rPr>
           <w:rFonts w:ascii="Times New Roman" w:hAnsi="Times New Roman" w:cs="Times New Roman"/>
@@ -1637,7 +1815,63 @@
         <w:rPr>
           <w:rFonts w:ascii="Times New Roman" w:hAnsi="Times New Roman" w:cs="Times New Roman"/>
         </w:rPr>
-        <w:t xml:space="preserve"> therefore, our team has decided to start early enough to account for experimentation. Since we are on the Student Subscription, with 100 free credits, we will not be able to test the hosting until later in the semester (approximately 3 weeks from presentation). Azure hosting will give us a public domain. Once this is received, email verification can be finished.</w:t>
+        <w:t xml:space="preserve"> therefore, our team has decided to start early enough to account for experimentation. Since we are on the Student Subscription, with </w:t>
+      </w:r>
+      <w:proofErr w:type="gramStart"/>
+      <w:r>
+        <w:rPr>
+          <w:rFonts w:ascii="Times New Roman" w:hAnsi="Times New Roman" w:cs="Times New Roman"/>
+        </w:rPr>
+        <w:t>100</w:t>
+      </w:r>
+      <w:proofErr w:type="gramEnd"/>
+      <w:r>
+        <w:rPr>
+          <w:rFonts w:ascii="Times New Roman" w:hAnsi="Times New Roman" w:cs="Times New Roman"/>
+        </w:rPr>
+        <w:t xml:space="preserve"> free credits, we will not be able to </w:t>
+      </w:r>
+      <w:proofErr w:type="gramStart"/>
+      <w:r>
+        <w:rPr>
+          <w:rFonts w:ascii="Times New Roman" w:hAnsi="Times New Roman" w:cs="Times New Roman"/>
+        </w:rPr>
+        <w:t>test</w:t>
+      </w:r>
+      <w:proofErr w:type="gramEnd"/>
+      <w:r>
+        <w:rPr>
+          <w:rFonts w:ascii="Times New Roman" w:hAnsi="Times New Roman" w:cs="Times New Roman"/>
+        </w:rPr>
+        <w:t xml:space="preserve"> the hosting until later in the semester (approximately 3 weeks from presentation). Azure hosting will give us a public domain. Once this </w:t>
+      </w:r>
+      <w:proofErr w:type="gramStart"/>
+      <w:r>
+        <w:rPr>
+          <w:rFonts w:ascii="Times New Roman" w:hAnsi="Times New Roman" w:cs="Times New Roman"/>
+        </w:rPr>
+        <w:t>is received</w:t>
+      </w:r>
+      <w:proofErr w:type="gramEnd"/>
+      <w:r>
+        <w:rPr>
+          <w:rFonts w:ascii="Times New Roman" w:hAnsi="Times New Roman" w:cs="Times New Roman"/>
+        </w:rPr>
+        <w:t xml:space="preserve">, email verification can </w:t>
+      </w:r>
+      <w:proofErr w:type="gramStart"/>
+      <w:r>
+        <w:rPr>
+          <w:rFonts w:ascii="Times New Roman" w:hAnsi="Times New Roman" w:cs="Times New Roman"/>
+        </w:rPr>
+        <w:t>be finished</w:t>
+      </w:r>
+      <w:proofErr w:type="gramEnd"/>
+      <w:r>
+        <w:rPr>
+          <w:rFonts w:ascii="Times New Roman" w:hAnsi="Times New Roman" w:cs="Times New Roman"/>
+        </w:rPr>
+        <w:t>.</w:t>
       </w:r>
     </w:p>
     <w:p>
@@ -1775,6 +2009,53 @@
     </w:p>
     <w:p>
       <w:pPr>
+        <w:pStyle w:val="ListParagraph"/>
+        <w:numPr>
+          <w:ilvl w:val="0"/>
+          <w:numId w:val="14"/>
+        </w:numPr>
+        <w:spacing w:line="480" w:lineRule="auto"/>
+        <w:rPr>
+          <w:rFonts w:ascii="Times New Roman" w:hAnsi="Times New Roman" w:cs="Times New Roman"/>
+        </w:rPr>
+      </w:pPr>
+      <w:r>
+        <w:rPr>
+          <w:rFonts w:ascii="Times New Roman" w:hAnsi="Times New Roman" w:cs="Times New Roman"/>
+        </w:rPr>
+        <w:t xml:space="preserve">We faced a challenge when deciding if we should allow users to be able to add a badge picture to challenges. But this brought up the question of </w:t>
+      </w:r>
+      <w:proofErr w:type="gramStart"/>
+      <w:r>
+        <w:rPr>
+          <w:rFonts w:ascii="Times New Roman" w:hAnsi="Times New Roman" w:cs="Times New Roman"/>
+        </w:rPr>
+        <w:t>if</w:t>
+      </w:r>
+      <w:proofErr w:type="gramEnd"/>
+      <w:r>
+        <w:rPr>
+          <w:rFonts w:ascii="Times New Roman" w:hAnsi="Times New Roman" w:cs="Times New Roman"/>
+        </w:rPr>
+        <w:t xml:space="preserve"> we should allow users to use </w:t>
+      </w:r>
+      <w:proofErr w:type="gramStart"/>
+      <w:r>
+        <w:rPr>
+          <w:rFonts w:ascii="Times New Roman" w:hAnsi="Times New Roman" w:cs="Times New Roman"/>
+        </w:rPr>
+        <w:t>add specific picture</w:t>
+      </w:r>
+      <w:proofErr w:type="gramEnd"/>
+      <w:r>
+        <w:rPr>
+          <w:rFonts w:ascii="Times New Roman" w:hAnsi="Times New Roman" w:cs="Times New Roman"/>
+        </w:rPr>
+        <w:t xml:space="preserve"> for other features like a profile picture.</w:t>
+      </w:r>
+    </w:p>
+    <w:p>
+      <w:pPr>
         <w:spacing w:line="480" w:lineRule="auto"/>
         <w:rPr>
           <w:rFonts w:ascii="Times New Roman" w:hAnsi="Times New Roman" w:cs="Times New Roman"/>
@@ -1845,7 +2126,21 @@
         <w:rPr>
           <w:rFonts w:ascii="Times New Roman" w:hAnsi="Times New Roman" w:cs="Times New Roman"/>
         </w:rPr>
-        <w:t xml:space="preserve">. Now, only coaches can be allowed into their team specific page, and our next step is to have them invite their athletes into the team and ensure only their athletes are accessing the </w:t>
+        <w:t xml:space="preserve">. Now, only coaches can </w:t>
+      </w:r>
+      <w:proofErr w:type="gramStart"/>
+      <w:r>
+        <w:rPr>
+          <w:rFonts w:ascii="Times New Roman" w:hAnsi="Times New Roman" w:cs="Times New Roman"/>
+        </w:rPr>
+        <w:t>be allowed</w:t>
+      </w:r>
+      <w:proofErr w:type="gramEnd"/>
+      <w:r>
+        <w:rPr>
+          <w:rFonts w:ascii="Times New Roman" w:hAnsi="Times New Roman" w:cs="Times New Roman"/>
+        </w:rPr>
+        <w:t xml:space="preserve"> into their team specific page, and our next step is to have them invite their athletes into the team and ensure only their athletes are accessing the </w:t>
       </w:r>
       <w:r>
         <w:rPr>
@@ -1863,13 +2158,61 @@
         <w:rPr>
           <w:rFonts w:ascii="Times New Roman" w:hAnsi="Times New Roman" w:cs="Times New Roman"/>
         </w:rPr>
-        <w:t xml:space="preserve">This was also less work than populating every athlete’s email into the database, and this will allow coaches to invite their </w:t>
-      </w:r>
-      <w:r>
-        <w:rPr>
-          <w:rFonts w:ascii="Times New Roman" w:hAnsi="Times New Roman" w:cs="Times New Roman"/>
-        </w:rPr>
-        <w:t xml:space="preserve">incoming players every new season. </w:t>
+        <w:t xml:space="preserve">This </w:t>
+      </w:r>
+      <w:r>
+        <w:rPr>
+          <w:rFonts w:ascii="Times New Roman" w:hAnsi="Times New Roman" w:cs="Times New Roman"/>
+        </w:rPr>
+        <w:lastRenderedPageBreak/>
+        <w:t xml:space="preserve">was also less work than populating every athlete’s email into the database, and this will allow coaches to invite their </w:t>
+      </w:r>
+      <w:r>
+        <w:rPr>
+          <w:rFonts w:ascii="Times New Roman" w:hAnsi="Times New Roman" w:cs="Times New Roman"/>
+        </w:rPr>
+        <w:t>incoming players every new season.</w:t>
+      </w:r>
+    </w:p>
+    <w:p>
+      <w:pPr>
+        <w:pStyle w:val="ListParagraph"/>
+        <w:numPr>
+          <w:ilvl w:val="0"/>
+          <w:numId w:val="15"/>
+        </w:numPr>
+        <w:spacing w:line="480" w:lineRule="auto"/>
+        <w:rPr>
+          <w:rFonts w:ascii="Times New Roman" w:hAnsi="Times New Roman" w:cs="Times New Roman"/>
+          <w:b/>
+          <w:bCs/>
+        </w:rPr>
+      </w:pPr>
+      <w:r>
+        <w:rPr>
+          <w:rFonts w:ascii="Times New Roman" w:hAnsi="Times New Roman" w:cs="Times New Roman"/>
+        </w:rPr>
+        <w:t xml:space="preserve">As a team we decided </w:t>
+      </w:r>
+      <w:proofErr w:type="gramStart"/>
+      <w:r>
+        <w:rPr>
+          <w:rFonts w:ascii="Times New Roman" w:hAnsi="Times New Roman" w:cs="Times New Roman"/>
+        </w:rPr>
+        <w:t>allowing</w:t>
+      </w:r>
+      <w:proofErr w:type="gramEnd"/>
+      <w:r>
+        <w:rPr>
+          <w:rFonts w:ascii="Times New Roman" w:hAnsi="Times New Roman" w:cs="Times New Roman"/>
+        </w:rPr>
+        <w:t xml:space="preserve"> users to upload individual pictures could fill up the database extremely fast and would not be the best idea for our project.</w:t>
+      </w:r>
+      <w:r>
+        <w:rPr>
+          <w:rFonts w:ascii="Times New Roman" w:hAnsi="Times New Roman" w:cs="Times New Roman"/>
+        </w:rPr>
+        <w:t xml:space="preserve"> </w:t>
       </w:r>
     </w:p>
     <w:p>
@@ -1884,7 +2227,7 @@
           <w:szCs w:val="24"/>
         </w:rPr>
       </w:pPr>
-      <w:bookmarkStart w:id="2" w:name="_Toc225582569"/>
+      <w:bookmarkStart w:id="2" w:name="_Toc225707086"/>
       <w:r>
         <w:rPr>
           <w:rFonts w:ascii="Times New Roman" w:hAnsi="Times New Roman" w:cs="Times New Roman"/>
@@ -1894,7 +2237,6 @@
           <w:sz w:val="24"/>
           <w:szCs w:val="24"/>
         </w:rPr>
-        <w:lastRenderedPageBreak/>
         <w:t>Team Progress:</w:t>
       </w:r>
       <w:bookmarkEnd w:id="2"/>
@@ -1939,7 +2281,7 @@
           <w:szCs w:val="24"/>
         </w:rPr>
       </w:pPr>
-      <w:bookmarkStart w:id="3" w:name="_Toc225582570"/>
+      <w:bookmarkStart w:id="3" w:name="_Toc225707087"/>
       <w:r>
         <w:rPr>
           <w:rFonts w:ascii="Times New Roman" w:hAnsi="Times New Roman" w:cs="Times New Roman"/>
@@ -2025,7 +2367,7 @@
           <w:szCs w:val="24"/>
         </w:rPr>
       </w:pPr>
-      <w:bookmarkStart w:id="4" w:name="_Toc225582571"/>
+      <w:bookmarkStart w:id="4" w:name="_Toc225707088"/>
       <w:r>
         <w:rPr>
           <w:rFonts w:ascii="Times New Roman" w:hAnsi="Times New Roman" w:cs="Times New Roman"/>
@@ -2097,13 +2439,41 @@
         <w:rPr>
           <w:rFonts w:ascii="Times New Roman" w:hAnsi="Times New Roman" w:cs="Times New Roman"/>
         </w:rPr>
-        <w:t>Our current plan for week 12 will be to finalize components</w:t>
-      </w:r>
-      <w:r>
-        <w:rPr>
-          <w:rFonts w:ascii="Times New Roman" w:hAnsi="Times New Roman" w:cs="Times New Roman"/>
-        </w:rPr>
-        <w:t xml:space="preserve">. With roughly 4 weeks of development time left, we need to move to the next stages in our project. </w:t>
+        <w:t xml:space="preserve">Our current plan for week </w:t>
+      </w:r>
+      <w:proofErr w:type="gramStart"/>
+      <w:r>
+        <w:rPr>
+          <w:rFonts w:ascii="Times New Roman" w:hAnsi="Times New Roman" w:cs="Times New Roman"/>
+        </w:rPr>
+        <w:t>12</w:t>
+      </w:r>
+      <w:proofErr w:type="gramEnd"/>
+      <w:r>
+        <w:rPr>
+          <w:rFonts w:ascii="Times New Roman" w:hAnsi="Times New Roman" w:cs="Times New Roman"/>
+        </w:rPr>
+        <w:t xml:space="preserve"> will be to finalize components</w:t>
+      </w:r>
+      <w:r>
+        <w:rPr>
+          <w:rFonts w:ascii="Times New Roman" w:hAnsi="Times New Roman" w:cs="Times New Roman"/>
+        </w:rPr>
+        <w:t xml:space="preserve">. With </w:t>
+      </w:r>
+      <w:proofErr w:type="gramStart"/>
+      <w:r>
+        <w:rPr>
+          <w:rFonts w:ascii="Times New Roman" w:hAnsi="Times New Roman" w:cs="Times New Roman"/>
+        </w:rPr>
+        <w:t>roughly 4</w:t>
+      </w:r>
+      <w:proofErr w:type="gramEnd"/>
+      <w:r>
+        <w:rPr>
+          <w:rFonts w:ascii="Times New Roman" w:hAnsi="Times New Roman" w:cs="Times New Roman"/>
+        </w:rPr>
+        <w:t xml:space="preserve"> weeks of development time left, we need to move to the next stages in our project. </w:t>
       </w:r>
       <w:r>
         <w:rPr>
@@ -2169,13 +2539,26 @@
         <w:rPr>
           <w:rFonts w:ascii="Times New Roman" w:hAnsi="Times New Roman" w:cs="Times New Roman"/>
         </w:rPr>
-        <w:t xml:space="preserve">Azure Student hosting will also take time to for initialization and launch process. </w:t>
-      </w:r>
-      <w:r>
-        <w:rPr>
-          <w:rFonts w:ascii="Times New Roman" w:hAnsi="Times New Roman" w:cs="Times New Roman"/>
-        </w:rPr>
-        <w:lastRenderedPageBreak/>
+        <w:t xml:space="preserve">Azure Student hosting will also take time </w:t>
+      </w:r>
+      <w:proofErr w:type="gramStart"/>
+      <w:r>
+        <w:rPr>
+          <w:rFonts w:ascii="Times New Roman" w:hAnsi="Times New Roman" w:cs="Times New Roman"/>
+        </w:rPr>
+        <w:t>to for initialization</w:t>
+      </w:r>
+      <w:proofErr w:type="gramEnd"/>
+      <w:r>
+        <w:rPr>
+          <w:rFonts w:ascii="Times New Roman" w:hAnsi="Times New Roman" w:cs="Times New Roman"/>
+        </w:rPr>
+        <w:t xml:space="preserve"> and launch process. </w:t>
+      </w:r>
+      <w:r>
+        <w:rPr>
+          <w:rFonts w:ascii="Times New Roman" w:hAnsi="Times New Roman" w:cs="Times New Roman"/>
+        </w:rPr>
         <w:t xml:space="preserve">Final steps will also be to complete the email feature. </w:t>
       </w:r>
       <w:r>
@@ -2231,7 +2614,7 @@
         </w:rPr>
         <w:br w:type="page"/>
       </w:r>
-      <w:bookmarkStart w:id="5" w:name="_Toc225582572"/>
+      <w:bookmarkStart w:id="5" w:name="_Toc225707089"/>
       <w:r>
         <w:rPr>
           <w:rFonts w:ascii="Times New Roman" w:hAnsi="Times New Roman" w:cs="Times New Roman"/>

</xml_diff>

<commit_message>
fixed report and slides from being overwritten
</commit_message>
<xml_diff>
--- a/Documentation/Weekly Report/week11/CMSC-4920-Week11Report-Group2.docx
+++ b/Documentation/Weekly Report/week11/CMSC-4920-Week11Report-Group2.docx
@@ -683,7 +683,6 @@
         </w:rPr>
         <w:t xml:space="preserve">Week </w:t>
       </w:r>
-      <w:proofErr w:type="gramStart"/>
       <w:r>
         <w:rPr>
           <w:rFonts w:ascii="Times New Roman" w:hAnsi="Times New Roman" w:cs="Times New Roman"/>
@@ -696,7 +695,6 @@
         </w:rPr>
         <w:t>1</w:t>
       </w:r>
-      <w:proofErr w:type="gramEnd"/>
     </w:p>
     <w:p>
       <w:pPr>
@@ -1426,77 +1424,7 @@
         <w:rPr>
           <w:rFonts w:ascii="Times New Roman" w:hAnsi="Times New Roman" w:cs="Times New Roman"/>
         </w:rPr>
-        <w:t xml:space="preserve">As we </w:t>
-      </w:r>
-      <w:proofErr w:type="gramStart"/>
-      <w:r>
-        <w:rPr>
-          <w:rFonts w:ascii="Times New Roman" w:hAnsi="Times New Roman" w:cs="Times New Roman"/>
-        </w:rPr>
-        <w:t>near</w:t>
-      </w:r>
-      <w:proofErr w:type="gramEnd"/>
-      <w:r>
-        <w:rPr>
-          <w:rFonts w:ascii="Times New Roman" w:hAnsi="Times New Roman" w:cs="Times New Roman"/>
-        </w:rPr>
-        <w:t xml:space="preserve"> the end of the Spring 2026 semester, our Senior Project team viewed this week as both finalization and heavy development. Features were both built and polished. Overall debugging </w:t>
-      </w:r>
-      <w:proofErr w:type="gramStart"/>
-      <w:r>
-        <w:rPr>
-          <w:rFonts w:ascii="Times New Roman" w:hAnsi="Times New Roman" w:cs="Times New Roman"/>
-        </w:rPr>
-        <w:t>was held</w:t>
-      </w:r>
-      <w:proofErr w:type="gramEnd"/>
-      <w:r>
-        <w:rPr>
-          <w:rFonts w:ascii="Times New Roman" w:hAnsi="Times New Roman" w:cs="Times New Roman"/>
-        </w:rPr>
-        <w:t xml:space="preserve"> to ensure that remaining bugs </w:t>
-      </w:r>
-      <w:proofErr w:type="gramStart"/>
-      <w:r>
-        <w:rPr>
-          <w:rFonts w:ascii="Times New Roman" w:hAnsi="Times New Roman" w:cs="Times New Roman"/>
-        </w:rPr>
-        <w:t>were resolved</w:t>
-      </w:r>
-      <w:proofErr w:type="gramEnd"/>
-      <w:r>
-        <w:rPr>
-          <w:rFonts w:ascii="Times New Roman" w:hAnsi="Times New Roman" w:cs="Times New Roman"/>
-        </w:rPr>
-        <w:t xml:space="preserve">. User study </w:t>
-      </w:r>
-      <w:proofErr w:type="gramStart"/>
-      <w:r>
-        <w:rPr>
-          <w:rFonts w:ascii="Times New Roman" w:hAnsi="Times New Roman" w:cs="Times New Roman"/>
-        </w:rPr>
-        <w:t>was additionally held</w:t>
-      </w:r>
-      <w:proofErr w:type="gramEnd"/>
-      <w:r>
-        <w:rPr>
-          <w:rFonts w:ascii="Times New Roman" w:hAnsi="Times New Roman" w:cs="Times New Roman"/>
-        </w:rPr>
-        <w:t xml:space="preserve"> to ensure that the Vulcan Activity Tracker meets both set requirements and usability. </w:t>
-      </w:r>
-      <w:proofErr w:type="gramStart"/>
-      <w:r>
-        <w:rPr>
-          <w:rFonts w:ascii="Times New Roman" w:hAnsi="Times New Roman" w:cs="Times New Roman"/>
-        </w:rPr>
-        <w:t>Several</w:t>
-      </w:r>
-      <w:proofErr w:type="gramEnd"/>
-      <w:r>
-        <w:rPr>
-          <w:rFonts w:ascii="Times New Roman" w:hAnsi="Times New Roman" w:cs="Times New Roman"/>
-        </w:rPr>
-        <w:t xml:space="preserve"> goals were set for this week to maintain proper schedule.</w:t>
+        <w:t>As we near the end of the Spring 2026 semester, our Senior Project team viewed this week as both finalization and heavy development. Features were both built and polished. Overall debugging was held to ensure that remaining bugs were resolved. User study was additionally held to ensure that the Vulcan Activity Tracker meets both set requirements and usability. Several goals were set for this week to maintain proper schedule.</w:t>
       </w:r>
     </w:p>
     <w:p>
@@ -1543,21 +1471,7 @@
         <w:rPr>
           <w:rFonts w:ascii="Times New Roman" w:hAnsi="Times New Roman" w:cs="Times New Roman"/>
         </w:rPr>
-        <w:t xml:space="preserve">There were </w:t>
-      </w:r>
-      <w:proofErr w:type="gramStart"/>
-      <w:r>
-        <w:rPr>
-          <w:rFonts w:ascii="Times New Roman" w:hAnsi="Times New Roman" w:cs="Times New Roman"/>
-        </w:rPr>
-        <w:t>a few</w:t>
-      </w:r>
-      <w:proofErr w:type="gramEnd"/>
-      <w:r>
-        <w:rPr>
-          <w:rFonts w:ascii="Times New Roman" w:hAnsi="Times New Roman" w:cs="Times New Roman"/>
-        </w:rPr>
-        <w:t xml:space="preserve"> components that were remaining since they required waiting for other pages development. For example, the friends feature now displays total counts of clubs, activities, and friends on the profile tag. This allows a user to see what kind of participation their friend had or has interacted with. The completion of this goal also resulted in construction of server-side components.</w:t>
+        <w:t>There were a few components that were remaining since they required waiting for other pages development. For example, the friends feature now displays total counts of clubs, activities, and friends on the profile tag. This allows a user to see what kind of participation their friend had or has interacted with. The completion of this goal also resulted in construction of server-side components.</w:t>
       </w:r>
     </w:p>
     <w:p>
@@ -1572,55 +1486,13 @@
         <w:rPr>
           <w:rFonts w:ascii="Times New Roman" w:hAnsi="Times New Roman" w:cs="Times New Roman"/>
         </w:rPr>
-        <w:t xml:space="preserve">Ui updates were the second main goal of the week. Ensuring that all pages and scaling matched was </w:t>
-      </w:r>
-      <w:proofErr w:type="gramStart"/>
-      <w:r>
-        <w:rPr>
-          <w:rFonts w:ascii="Times New Roman" w:hAnsi="Times New Roman" w:cs="Times New Roman"/>
-        </w:rPr>
-        <w:t>very important</w:t>
-      </w:r>
-      <w:proofErr w:type="gramEnd"/>
-      <w:r>
-        <w:rPr>
-          <w:rFonts w:ascii="Times New Roman" w:hAnsi="Times New Roman" w:cs="Times New Roman"/>
-        </w:rPr>
-        <w:t xml:space="preserve"> to us. The overall experience of the Vulcan Activity Tracker is of highest priority since user impression determines how </w:t>
-      </w:r>
-      <w:r>
-        <w:rPr>
-          <w:rFonts w:ascii="Times New Roman" w:hAnsi="Times New Roman" w:cs="Times New Roman"/>
-        </w:rPr>
-        <w:t xml:space="preserve">our app </w:t>
-      </w:r>
-      <w:proofErr w:type="gramStart"/>
-      <w:r>
-        <w:rPr>
-          <w:rFonts w:ascii="Times New Roman" w:hAnsi="Times New Roman" w:cs="Times New Roman"/>
-        </w:rPr>
-        <w:t>is perceived</w:t>
-      </w:r>
-      <w:proofErr w:type="gramEnd"/>
-      <w:r>
-        <w:rPr>
-          <w:rFonts w:ascii="Times New Roman" w:hAnsi="Times New Roman" w:cs="Times New Roman"/>
-        </w:rPr>
-        <w:t xml:space="preserve">. Work </w:t>
-      </w:r>
-      <w:proofErr w:type="gramStart"/>
-      <w:r>
-        <w:rPr>
-          <w:rFonts w:ascii="Times New Roman" w:hAnsi="Times New Roman" w:cs="Times New Roman"/>
-        </w:rPr>
-        <w:t>was done</w:t>
-      </w:r>
-      <w:proofErr w:type="gramEnd"/>
-      <w:r>
-        <w:rPr>
-          <w:rFonts w:ascii="Times New Roman" w:hAnsi="Times New Roman" w:cs="Times New Roman"/>
-        </w:rPr>
-        <w:t xml:space="preserve"> to correct the settings page formatting and propagate fields from the server’s database. </w:t>
+        <w:t xml:space="preserve">Ui updates were the second main goal of the week. Ensuring that all pages and scaling matched was very important to us. The overall experience of the Vulcan Activity Tracker is of highest priority since user impression determines how </w:t>
+      </w:r>
+      <w:r>
+        <w:rPr>
+          <w:rFonts w:ascii="Times New Roman" w:hAnsi="Times New Roman" w:cs="Times New Roman"/>
+        </w:rPr>
+        <w:t xml:space="preserve">our app is perceived. Work was done to correct the settings page formatting and propagate fields from the server’s database. </w:t>
       </w:r>
       <w:r>
         <w:rPr>
@@ -1641,83 +1513,13 @@
         <w:rPr>
           <w:rFonts w:ascii="Times New Roman" w:hAnsi="Times New Roman" w:cs="Times New Roman"/>
         </w:rPr>
-        <w:t xml:space="preserve">Additional development </w:t>
-      </w:r>
-      <w:proofErr w:type="gramStart"/>
-      <w:r>
-        <w:rPr>
-          <w:rFonts w:ascii="Times New Roman" w:hAnsi="Times New Roman" w:cs="Times New Roman"/>
-        </w:rPr>
-        <w:t>was made</w:t>
-      </w:r>
-      <w:proofErr w:type="gramEnd"/>
-      <w:r>
-        <w:rPr>
-          <w:rFonts w:ascii="Times New Roman" w:hAnsi="Times New Roman" w:cs="Times New Roman"/>
-        </w:rPr>
-        <w:t xml:space="preserve"> to the challenges and team pages. Mini team dashboards </w:t>
-      </w:r>
-      <w:proofErr w:type="gramStart"/>
-      <w:r>
-        <w:rPr>
-          <w:rFonts w:ascii="Times New Roman" w:hAnsi="Times New Roman" w:cs="Times New Roman"/>
-        </w:rPr>
-        <w:t>were simulated</w:t>
-      </w:r>
-      <w:proofErr w:type="gramEnd"/>
-      <w:r>
-        <w:rPr>
-          <w:rFonts w:ascii="Times New Roman" w:hAnsi="Times New Roman" w:cs="Times New Roman"/>
-        </w:rPr>
-        <w:t xml:space="preserve"> to give coaches managerial options. Team features have </w:t>
-      </w:r>
-      <w:proofErr w:type="gramStart"/>
-      <w:r>
-        <w:rPr>
-          <w:rFonts w:ascii="Times New Roman" w:hAnsi="Times New Roman" w:cs="Times New Roman"/>
-        </w:rPr>
-        <w:t>been limited</w:t>
-      </w:r>
-      <w:proofErr w:type="gramEnd"/>
-      <w:r>
-        <w:rPr>
-          <w:rFonts w:ascii="Times New Roman" w:hAnsi="Times New Roman" w:cs="Times New Roman"/>
-        </w:rPr>
-        <w:t xml:space="preserve"> to coaches only, verified by emails. Challenges n</w:t>
-      </w:r>
-      <w:r>
-        <w:rPr>
-          <w:rFonts w:ascii="Times New Roman" w:hAnsi="Times New Roman" w:cs="Times New Roman"/>
-        </w:rPr>
-        <w:t xml:space="preserve">ow have increased social interaction. Top three challenge participants </w:t>
-      </w:r>
-      <w:proofErr w:type="gramStart"/>
-      <w:r>
-        <w:rPr>
-          <w:rFonts w:ascii="Times New Roman" w:hAnsi="Times New Roman" w:cs="Times New Roman"/>
-        </w:rPr>
-        <w:t>are ranked</w:t>
-      </w:r>
-      <w:proofErr w:type="gramEnd"/>
-      <w:r>
-        <w:rPr>
-          <w:rFonts w:ascii="Times New Roman" w:hAnsi="Times New Roman" w:cs="Times New Roman"/>
-        </w:rPr>
-        <w:t xml:space="preserve"> with </w:t>
-      </w:r>
-      <w:proofErr w:type="gramStart"/>
-      <w:r>
-        <w:rPr>
-          <w:rFonts w:ascii="Times New Roman" w:hAnsi="Times New Roman" w:cs="Times New Roman"/>
-        </w:rPr>
-        <w:t>gold,</w:t>
-      </w:r>
-      <w:proofErr w:type="gramEnd"/>
-      <w:r>
-        <w:rPr>
-          <w:rFonts w:ascii="Times New Roman" w:hAnsi="Times New Roman" w:cs="Times New Roman"/>
-        </w:rPr>
-        <w:t xml:space="preserve"> silver bronze medals. Challenges also </w:t>
+        <w:t>Additional development was made to the challenges and team pages. Mini team dashboards were simulated to give coaches managerial options. Team features have been limited to coaches only, verified by emails. Challenges n</w:t>
+      </w:r>
+      <w:r>
+        <w:rPr>
+          <w:rFonts w:ascii="Times New Roman" w:hAnsi="Times New Roman" w:cs="Times New Roman"/>
+        </w:rPr>
+        <w:t xml:space="preserve">ow have increased social interaction. Top three challenge participants are ranked with gold, silver bronze medals. Challenges also </w:t>
       </w:r>
       <w:r>
         <w:rPr>
@@ -1741,21 +1543,7 @@
         <w:rPr>
           <w:rFonts w:ascii="Times New Roman" w:hAnsi="Times New Roman" w:cs="Times New Roman"/>
         </w:rPr>
-        <w:t xml:space="preserve"> own mini leaderboard. All these components of the Vulcan Activity Tracker </w:t>
-      </w:r>
-      <w:proofErr w:type="gramStart"/>
-      <w:r>
-        <w:rPr>
-          <w:rFonts w:ascii="Times New Roman" w:hAnsi="Times New Roman" w:cs="Times New Roman"/>
-        </w:rPr>
-        <w:t>allow for</w:t>
-      </w:r>
-      <w:proofErr w:type="gramEnd"/>
-      <w:r>
-        <w:rPr>
-          <w:rFonts w:ascii="Times New Roman" w:hAnsi="Times New Roman" w:cs="Times New Roman"/>
-        </w:rPr>
-        <w:t xml:space="preserve"> users to both have fun exercise logging abilities and participate in fun competitions with other platform </w:t>
+        <w:t xml:space="preserve"> own mini leaderboard. All these components of the Vulcan Activity Tracker allow for users to both have fun exercise logging abilities and participate in fun competitions with other platform </w:t>
       </w:r>
       <w:r>
         <w:rPr>
@@ -1791,14 +1579,12 @@
         </w:rPr>
         <w:t xml:space="preserve">The last goal of week </w:t>
       </w:r>
-      <w:proofErr w:type="gramStart"/>
       <w:r>
         <w:rPr>
           <w:rFonts w:ascii="Times New Roman" w:hAnsi="Times New Roman" w:cs="Times New Roman"/>
         </w:rPr>
         <w:t>11</w:t>
       </w:r>
-      <w:proofErr w:type="gramEnd"/>
       <w:r>
         <w:rPr>
           <w:rFonts w:ascii="Times New Roman" w:hAnsi="Times New Roman" w:cs="Times New Roman"/>
@@ -1815,63 +1601,7 @@
         <w:rPr>
           <w:rFonts w:ascii="Times New Roman" w:hAnsi="Times New Roman" w:cs="Times New Roman"/>
         </w:rPr>
-        <w:t xml:space="preserve"> therefore, our team has decided to start early enough to account for experimentation. Since we are on the Student Subscription, with </w:t>
-      </w:r>
-      <w:proofErr w:type="gramStart"/>
-      <w:r>
-        <w:rPr>
-          <w:rFonts w:ascii="Times New Roman" w:hAnsi="Times New Roman" w:cs="Times New Roman"/>
-        </w:rPr>
-        <w:t>100</w:t>
-      </w:r>
-      <w:proofErr w:type="gramEnd"/>
-      <w:r>
-        <w:rPr>
-          <w:rFonts w:ascii="Times New Roman" w:hAnsi="Times New Roman" w:cs="Times New Roman"/>
-        </w:rPr>
-        <w:t xml:space="preserve"> free credits, we will not be able to </w:t>
-      </w:r>
-      <w:proofErr w:type="gramStart"/>
-      <w:r>
-        <w:rPr>
-          <w:rFonts w:ascii="Times New Roman" w:hAnsi="Times New Roman" w:cs="Times New Roman"/>
-        </w:rPr>
-        <w:t>test</w:t>
-      </w:r>
-      <w:proofErr w:type="gramEnd"/>
-      <w:r>
-        <w:rPr>
-          <w:rFonts w:ascii="Times New Roman" w:hAnsi="Times New Roman" w:cs="Times New Roman"/>
-        </w:rPr>
-        <w:t xml:space="preserve"> the hosting until later in the semester (approximately 3 weeks from presentation). Azure hosting will give us a public domain. Once this </w:t>
-      </w:r>
-      <w:proofErr w:type="gramStart"/>
-      <w:r>
-        <w:rPr>
-          <w:rFonts w:ascii="Times New Roman" w:hAnsi="Times New Roman" w:cs="Times New Roman"/>
-        </w:rPr>
-        <w:t>is received</w:t>
-      </w:r>
-      <w:proofErr w:type="gramEnd"/>
-      <w:r>
-        <w:rPr>
-          <w:rFonts w:ascii="Times New Roman" w:hAnsi="Times New Roman" w:cs="Times New Roman"/>
-        </w:rPr>
-        <w:t xml:space="preserve">, email verification can </w:t>
-      </w:r>
-      <w:proofErr w:type="gramStart"/>
-      <w:r>
-        <w:rPr>
-          <w:rFonts w:ascii="Times New Roman" w:hAnsi="Times New Roman" w:cs="Times New Roman"/>
-        </w:rPr>
-        <w:t>be finished</w:t>
-      </w:r>
-      <w:proofErr w:type="gramEnd"/>
-      <w:r>
-        <w:rPr>
-          <w:rFonts w:ascii="Times New Roman" w:hAnsi="Times New Roman" w:cs="Times New Roman"/>
-        </w:rPr>
-        <w:t>.</w:t>
+        <w:t xml:space="preserve"> therefore, our team has decided to start early enough to account for experimentation. Since we are on the Student Subscription, with 100 free credits, we will not be able to test the hosting until later in the semester (approximately 3 weeks from presentation). Azure hosting will give us a public domain. Once this is received, email verification can be finished.</w:t>
       </w:r>
     </w:p>
     <w:p>
@@ -1938,55 +1668,13 @@
         <w:rPr>
           <w:rFonts w:ascii="Times New Roman" w:hAnsi="Times New Roman" w:cs="Times New Roman"/>
         </w:rPr>
-        <w:t xml:space="preserve">hen they tried to enter the </w:t>
-      </w:r>
-      <w:proofErr w:type="gramStart"/>
-      <w:r>
-        <w:rPr>
-          <w:rFonts w:ascii="Times New Roman" w:hAnsi="Times New Roman" w:cs="Times New Roman"/>
-        </w:rPr>
-        <w:t>teams</w:t>
-      </w:r>
-      <w:proofErr w:type="gramEnd"/>
-      <w:r>
-        <w:rPr>
-          <w:rFonts w:ascii="Times New Roman" w:hAnsi="Times New Roman" w:cs="Times New Roman"/>
-        </w:rPr>
-        <w:t xml:space="preserve"> page. However, the athlete’s </w:t>
-      </w:r>
-      <w:proofErr w:type="gramStart"/>
-      <w:r>
-        <w:rPr>
-          <w:rFonts w:ascii="Times New Roman" w:hAnsi="Times New Roman" w:cs="Times New Roman"/>
-        </w:rPr>
-        <w:t>email’s</w:t>
-      </w:r>
-      <w:proofErr w:type="gramEnd"/>
-      <w:r>
-        <w:rPr>
-          <w:rFonts w:ascii="Times New Roman" w:hAnsi="Times New Roman" w:cs="Times New Roman"/>
-        </w:rPr>
-        <w:t xml:space="preserve"> are not available to the public</w:t>
-      </w:r>
-      <w:r>
-        <w:rPr>
-          <w:rFonts w:ascii="Times New Roman" w:hAnsi="Times New Roman" w:cs="Times New Roman"/>
-        </w:rPr>
-        <w:t xml:space="preserve"> and if they were there </w:t>
-      </w:r>
-      <w:proofErr w:type="gramStart"/>
-      <w:r>
-        <w:rPr>
-          <w:rFonts w:ascii="Times New Roman" w:hAnsi="Times New Roman" w:cs="Times New Roman"/>
-        </w:rPr>
-        <w:t>was</w:t>
-      </w:r>
-      <w:proofErr w:type="gramEnd"/>
-      <w:r>
-        <w:rPr>
-          <w:rFonts w:ascii="Times New Roman" w:hAnsi="Times New Roman" w:cs="Times New Roman"/>
-        </w:rPr>
-        <w:t xml:space="preserve"> just so many to </w:t>
+        <w:t>hen they tried to enter the teams page. However, the athlete’s email’s are not available to the public</w:t>
+      </w:r>
+      <w:r>
+        <w:rPr>
+          <w:rFonts w:ascii="Times New Roman" w:hAnsi="Times New Roman" w:cs="Times New Roman"/>
+        </w:rPr>
+        <w:t xml:space="preserve"> and if they were there was just so many to </w:t>
       </w:r>
       <w:r>
         <w:rPr>
@@ -2023,35 +1711,7 @@
         <w:rPr>
           <w:rFonts w:ascii="Times New Roman" w:hAnsi="Times New Roman" w:cs="Times New Roman"/>
         </w:rPr>
-        <w:t xml:space="preserve">We faced a challenge when deciding if we should allow users to be able to add a badge picture to challenges. But this brought up the question of </w:t>
-      </w:r>
-      <w:proofErr w:type="gramStart"/>
-      <w:r>
-        <w:rPr>
-          <w:rFonts w:ascii="Times New Roman" w:hAnsi="Times New Roman" w:cs="Times New Roman"/>
-        </w:rPr>
-        <w:t>if</w:t>
-      </w:r>
-      <w:proofErr w:type="gramEnd"/>
-      <w:r>
-        <w:rPr>
-          <w:rFonts w:ascii="Times New Roman" w:hAnsi="Times New Roman" w:cs="Times New Roman"/>
-        </w:rPr>
-        <w:t xml:space="preserve"> we should allow users to use </w:t>
-      </w:r>
-      <w:proofErr w:type="gramStart"/>
-      <w:r>
-        <w:rPr>
-          <w:rFonts w:ascii="Times New Roman" w:hAnsi="Times New Roman" w:cs="Times New Roman"/>
-        </w:rPr>
-        <w:t>add specific picture</w:t>
-      </w:r>
-      <w:proofErr w:type="gramEnd"/>
-      <w:r>
-        <w:rPr>
-          <w:rFonts w:ascii="Times New Roman" w:hAnsi="Times New Roman" w:cs="Times New Roman"/>
-        </w:rPr>
-        <w:t xml:space="preserve"> for other features like a profile picture.</w:t>
+        <w:t>We faced a challenge when deciding if we should allow users to be able to add a badge picture to challenges. But this brought up the question of if we should allow users to use add specific picture for other features like a profile picture.</w:t>
       </w:r>
     </w:p>
     <w:p>
@@ -2126,21 +1786,7 @@
         <w:rPr>
           <w:rFonts w:ascii="Times New Roman" w:hAnsi="Times New Roman" w:cs="Times New Roman"/>
         </w:rPr>
-        <w:t xml:space="preserve">. Now, only coaches can </w:t>
-      </w:r>
-      <w:proofErr w:type="gramStart"/>
-      <w:r>
-        <w:rPr>
-          <w:rFonts w:ascii="Times New Roman" w:hAnsi="Times New Roman" w:cs="Times New Roman"/>
-        </w:rPr>
-        <w:t>be allowed</w:t>
-      </w:r>
-      <w:proofErr w:type="gramEnd"/>
-      <w:r>
-        <w:rPr>
-          <w:rFonts w:ascii="Times New Roman" w:hAnsi="Times New Roman" w:cs="Times New Roman"/>
-        </w:rPr>
-        <w:t xml:space="preserve"> into their team specific page, and our next step is to have them invite their athletes into the team and ensure only their athletes are accessing the </w:t>
+        <w:t xml:space="preserve">. Now, only coaches can be allowed into their team specific page, and our next step is to have them invite their athletes into the team and ensure only their athletes are accessing the </w:t>
       </w:r>
       <w:r>
         <w:rPr>
@@ -2192,21 +1838,7 @@
         <w:rPr>
           <w:rFonts w:ascii="Times New Roman" w:hAnsi="Times New Roman" w:cs="Times New Roman"/>
         </w:rPr>
-        <w:t xml:space="preserve">As a team we decided </w:t>
-      </w:r>
-      <w:proofErr w:type="gramStart"/>
-      <w:r>
-        <w:rPr>
-          <w:rFonts w:ascii="Times New Roman" w:hAnsi="Times New Roman" w:cs="Times New Roman"/>
-        </w:rPr>
-        <w:t>allowing</w:t>
-      </w:r>
-      <w:proofErr w:type="gramEnd"/>
-      <w:r>
-        <w:rPr>
-          <w:rFonts w:ascii="Times New Roman" w:hAnsi="Times New Roman" w:cs="Times New Roman"/>
-        </w:rPr>
-        <w:t xml:space="preserve"> users to upload individual pictures could fill up the database extremely fast and would not be the best idea for our project.</w:t>
+        <w:t>As a team we decided allowing users to upload individual pictures could fill up the database extremely fast and would not be the best idea for our project.</w:t>
       </w:r>
       <w:r>
         <w:rPr>
@@ -2342,6 +1974,7 @@
         </w:drawing>
       </w:r>
     </w:p>
+    <w:p/>
     <w:p>
       <w:pPr>
         <w:pStyle w:val="Heading1"/>
@@ -2354,10 +1987,8 @@
           <w:szCs w:val="24"/>
         </w:rPr>
       </w:pPr>
-    </w:p>
-    <w:p>
-      <w:pPr>
-        <w:pStyle w:val="Heading1"/>
+      <w:bookmarkStart w:id="4" w:name="_Toc225707088"/>
+      <w:r>
         <w:rPr>
           <w:rFonts w:ascii="Times New Roman" w:hAnsi="Times New Roman" w:cs="Times New Roman"/>
           <w:b/>
@@ -2366,8 +1997,9 @@
           <w:sz w:val="24"/>
           <w:szCs w:val="24"/>
         </w:rPr>
-      </w:pPr>
-      <w:bookmarkStart w:id="4" w:name="_Toc225707088"/>
+        <w:lastRenderedPageBreak/>
+        <w:t xml:space="preserve">Week </w:t>
+      </w:r>
       <w:r>
         <w:rPr>
           <w:rFonts w:ascii="Times New Roman" w:hAnsi="Times New Roman" w:cs="Times New Roman"/>
@@ -2377,7 +2009,7 @@
           <w:sz w:val="24"/>
           <w:szCs w:val="24"/>
         </w:rPr>
-        <w:t xml:space="preserve">Week </w:t>
+        <w:t>1</w:t>
       </w:r>
       <w:r>
         <w:rPr>
@@ -2388,7 +2020,7 @@
           <w:sz w:val="24"/>
           <w:szCs w:val="24"/>
         </w:rPr>
-        <w:t>1</w:t>
+        <w:t>2</w:t>
       </w:r>
       <w:r>
         <w:rPr>
@@ -2399,7 +2031,7 @@
           <w:sz w:val="24"/>
           <w:szCs w:val="24"/>
         </w:rPr>
-        <w:t>2</w:t>
+        <w:t xml:space="preserve"> </w:t>
       </w:r>
       <w:r>
         <w:rPr>
@@ -2410,17 +2042,6 @@
           <w:sz w:val="24"/>
           <w:szCs w:val="24"/>
         </w:rPr>
-        <w:t xml:space="preserve"> </w:t>
-      </w:r>
-      <w:r>
-        <w:rPr>
-          <w:rFonts w:ascii="Times New Roman" w:hAnsi="Times New Roman" w:cs="Times New Roman"/>
-          <w:b/>
-          <w:bCs/>
-          <w:color w:val="auto"/>
-          <w:sz w:val="24"/>
-          <w:szCs w:val="24"/>
-        </w:rPr>
         <w:t>Plan:</w:t>
       </w:r>
       <w:bookmarkEnd w:id="4"/>
@@ -2439,61 +2060,19 @@
         <w:rPr>
           <w:rFonts w:ascii="Times New Roman" w:hAnsi="Times New Roman" w:cs="Times New Roman"/>
         </w:rPr>
-        <w:t xml:space="preserve">Our current plan for week </w:t>
-      </w:r>
-      <w:proofErr w:type="gramStart"/>
-      <w:r>
-        <w:rPr>
-          <w:rFonts w:ascii="Times New Roman" w:hAnsi="Times New Roman" w:cs="Times New Roman"/>
-        </w:rPr>
-        <w:t>12</w:t>
-      </w:r>
-      <w:proofErr w:type="gramEnd"/>
-      <w:r>
-        <w:rPr>
-          <w:rFonts w:ascii="Times New Roman" w:hAnsi="Times New Roman" w:cs="Times New Roman"/>
-        </w:rPr>
-        <w:t xml:space="preserve"> will be to finalize components</w:t>
-      </w:r>
-      <w:r>
-        <w:rPr>
-          <w:rFonts w:ascii="Times New Roman" w:hAnsi="Times New Roman" w:cs="Times New Roman"/>
-        </w:rPr>
-        <w:t xml:space="preserve">. With </w:t>
-      </w:r>
-      <w:proofErr w:type="gramStart"/>
-      <w:r>
-        <w:rPr>
-          <w:rFonts w:ascii="Times New Roman" w:hAnsi="Times New Roman" w:cs="Times New Roman"/>
-        </w:rPr>
-        <w:t>roughly 4</w:t>
-      </w:r>
-      <w:proofErr w:type="gramEnd"/>
-      <w:r>
-        <w:rPr>
-          <w:rFonts w:ascii="Times New Roman" w:hAnsi="Times New Roman" w:cs="Times New Roman"/>
-        </w:rPr>
-        <w:t xml:space="preserve"> weeks of development time left, we need to move to the next stages in our project. </w:t>
-      </w:r>
-      <w:r>
-        <w:rPr>
-          <w:rFonts w:ascii="Times New Roman" w:hAnsi="Times New Roman" w:cs="Times New Roman"/>
-        </w:rPr>
-        <w:t xml:space="preserve">This will be the completion of the app, finalization, and overall debugging process. We need to </w:t>
-      </w:r>
-      <w:proofErr w:type="gramStart"/>
-      <w:r>
-        <w:rPr>
-          <w:rFonts w:ascii="Times New Roman" w:hAnsi="Times New Roman" w:cs="Times New Roman"/>
-        </w:rPr>
-        <w:t>allow for</w:t>
-      </w:r>
-      <w:proofErr w:type="gramEnd"/>
-      <w:r>
-        <w:rPr>
-          <w:rFonts w:ascii="Times New Roman" w:hAnsi="Times New Roman" w:cs="Times New Roman"/>
-        </w:rPr>
-        <w:t xml:space="preserve"> time for testing to ensure that all features work properly</w:t>
+        <w:t>Our current plan for week 12 will be to finalize components</w:t>
+      </w:r>
+      <w:r>
+        <w:rPr>
+          <w:rFonts w:ascii="Times New Roman" w:hAnsi="Times New Roman" w:cs="Times New Roman"/>
+        </w:rPr>
+        <w:t xml:space="preserve">. With roughly 4 weeks of development time left, we need to move to the next stages in our project. </w:t>
+      </w:r>
+      <w:r>
+        <w:rPr>
+          <w:rFonts w:ascii="Times New Roman" w:hAnsi="Times New Roman" w:cs="Times New Roman"/>
+        </w:rPr>
+        <w:t>This will be the completion of the app, finalization, and overall debugging process. We need to allow for time for testing to ensure that all features work properly</w:t>
       </w:r>
       <w:r>
         <w:rPr>
@@ -2505,55 +2084,13 @@
         <w:rPr>
           <w:rFonts w:ascii="Times New Roman" w:hAnsi="Times New Roman" w:cs="Times New Roman"/>
         </w:rPr>
-        <w:t xml:space="preserve">We </w:t>
-      </w:r>
-      <w:proofErr w:type="gramStart"/>
-      <w:r>
-        <w:rPr>
-          <w:rFonts w:ascii="Times New Roman" w:hAnsi="Times New Roman" w:cs="Times New Roman"/>
-        </w:rPr>
-        <w:t>have to</w:t>
-      </w:r>
-      <w:proofErr w:type="gramEnd"/>
-      <w:r>
-        <w:rPr>
-          <w:rFonts w:ascii="Times New Roman" w:hAnsi="Times New Roman" w:cs="Times New Roman"/>
-        </w:rPr>
-        <w:t xml:space="preserve"> complete the </w:t>
-      </w:r>
-      <w:proofErr w:type="gramStart"/>
-      <w:r>
-        <w:rPr>
-          <w:rFonts w:ascii="Times New Roman" w:hAnsi="Times New Roman" w:cs="Times New Roman"/>
-        </w:rPr>
-        <w:t>teams</w:t>
-      </w:r>
-      <w:proofErr w:type="gramEnd"/>
-      <w:r>
-        <w:rPr>
-          <w:rFonts w:ascii="Times New Roman" w:hAnsi="Times New Roman" w:cs="Times New Roman"/>
-        </w:rPr>
-        <w:t xml:space="preserve"> page, which includes having invites to team members and having them be able to view their team specific page and stats. </w:t>
-      </w:r>
-      <w:r>
-        <w:rPr>
-          <w:rFonts w:ascii="Times New Roman" w:hAnsi="Times New Roman" w:cs="Times New Roman"/>
-        </w:rPr>
-        <w:t xml:space="preserve">Azure Student hosting will also take time </w:t>
-      </w:r>
-      <w:proofErr w:type="gramStart"/>
-      <w:r>
-        <w:rPr>
-          <w:rFonts w:ascii="Times New Roman" w:hAnsi="Times New Roman" w:cs="Times New Roman"/>
-        </w:rPr>
-        <w:t>to for initialization</w:t>
-      </w:r>
-      <w:proofErr w:type="gramEnd"/>
-      <w:r>
-        <w:rPr>
-          <w:rFonts w:ascii="Times New Roman" w:hAnsi="Times New Roman" w:cs="Times New Roman"/>
-        </w:rPr>
-        <w:t xml:space="preserve"> and launch process. </w:t>
+        <w:t xml:space="preserve">We have to complete the teams page, which includes having invites to team members and having them be able to view their team specific page and stats. </w:t>
+      </w:r>
+      <w:r>
+        <w:rPr>
+          <w:rFonts w:ascii="Times New Roman" w:hAnsi="Times New Roman" w:cs="Times New Roman"/>
+        </w:rPr>
+        <w:t xml:space="preserve">Azure Student hosting will also take time to for initialization and launch process. </w:t>
       </w:r>
       <w:r>
         <w:rPr>

</xml_diff>